<commit_message>
LBS (disc 18) complete: fix mobile (dedup collector/provider, align LbsEvent+channel+TA, Kotlin TA), improve SERVICE lbs.py (real path loss+multi), handler import, update TZ.docx (Прил.Б), clean 18.md+READMEs status. All 7 tasks + native CellInfo + verifs done. Tests+demo pass (114B SRT204+205 packets).
</commit_message>
<xml_diff>
--- a/DOCS/TZ_EGTS_RTLS_v2.docx
+++ b/DOCS/TZ_EGTS_RTLS_v2.docx
@@ -15100,6 +15100,110 @@
         </w:pBdr>
         <w:spacing w:after="300"/>
       </w:pPr>
+    </w:p>
+    <w:p>
+      <w:r>
+        <w:rPr>
+          <w:b/>
+          <w:sz w:val="24"/>
+        </w:rPr>
+        <w:t>Приложение Б. Позиционирование по LBS (базовым станциям сотовой связи) с использованием графа дорог (SRT 205)</w:t>
+      </w:r>
+    </w:p>
+    <w:p>
+      <w:r>
+        <w:t>Дополнение к ТЗ (на основе обсуждения 18-lbs-road-graph-positioning). LBS позволяет получать точную точку на дороге (road-constrained) даже при полном отсутствии или сильном ослаблении GNSS, комбинируя данные сотовых вышек (TA, RSSI, serving + neighbors) с известным графом дорог и IMU (heading).</w:t>
+      </w:r>
+    </w:p>
+    <w:p>
+      <w:r>
+        <w:rPr>
+          <w:b/>
+        </w:rPr>
+        <w:t>SRT 205 (EGTS_SR_CUSTOM_SRT205) — LBS DATA</w:t>
+      </w:r>
+    </w:p>
+    <w:p>
+      <w:r>
+        <w:t>Поля: serving_cell_id (uint32), lac_tac (uint16), mcc/mnc (uint16), rssi_dbm (int8), timing_advance (uint16), bs_lat/bs_lon (опционально), raw_lbs_lat/lon, neighbors (массив cell+rssi), lbs_quality (uint8).</w:t>
+      </w:r>
+    </w:p>
+    <w:p>
+      <w:r>
+        <w:rPr>
+          <w:b/>
+        </w:rPr>
+        <w:t>Серверная обработка (LBS-aware map matching):</w:t>
+      </w:r>
+    </w:p>
+    <w:p>
+      <w:r>
+        <w:t>1. Извлечь SRT 205 из RecordData (handler.py).</w:t>
+      </w:r>
+    </w:p>
+    <w:p>
+      <w:r>
+        <w:t>2. Построить emission likelihood: упрощённая модель затухания (Okumura-Hata) по расстоянию до известных BS + TA distance + RSSI fit для serving и 1-2 соседей.</w:t>
+      </w:r>
+    </w:p>
+    <w:p>
+      <w:r>
+        <w:t>3. Найти кандидатов дорог (PostGIS ST_DWithin вокруг грубой LBS или last known).</w:t>
+      </w:r>
+    </w:p>
+    <w:p>
+      <w:r>
+        <w:t>4. Viterbi / Particle на графе дорог (или простой geometric snap в sandbox версии) → snapped точка + road_id + confidence.</w:t>
+      </w:r>
+    </w:p>
+    <w:p>
+      <w:r>
+        <w:t>5. Использовать как обновление EKF (аналог GPS) или напрямую как road-constrained координату для РНИС (пробег, нарушения, маршруты).</w:t>
+      </w:r>
+    </w:p>
+    <w:p>
+      <w:r>
+        <w:rPr>
+          <w:b/>
+        </w:rPr>
+        <w:t>Мобильная часть:</w:t>
+      </w:r>
+    </w:p>
+    <w:p>
+      <w:r>
+        <w:t>LbsCollector (Dart + MethodChannel к TelephonyManager.getAllCellInfo()). TrackerProvider шлёт dedicated LBS-пакет (SRT 16 + 103 legacy + SRT 205) автоматически при смене cell (isNewCell) — без спама, но с полезными данными для survey и road matching. EgtsBuilder.buildLbsPacket + _buildLbsSrt205.</w:t>
+      </w:r>
+    </w:p>
+    <w:p>
+      <w:r>
+        <w:rPr>
+          <w:b/>
+        </w:rPr>
+        <w:t>Excel поддержка:</w:t>
+      </w:r>
+    </w:p>
+    <w:p>
+      <w:r>
+        <w:t>PARSER/egts_excel_parser.py содержит лист SRT_205 (двунаправленный decode/encode).</w:t>
+      </w:r>
+    </w:p>
+    <w:p>
+      <w:r>
+        <w:rPr>
+          <w:b/>
+        </w:rPr>
+        <w:t>Референсная реализация:</w:t>
+      </w:r>
+    </w:p>
+    <w:p>
+      <w:r>
+        <w:t>sandbox/lbs_map_matcher.py (generate_synthetic_lbs + lbs_likelihood + lbs_aware_snap_to_road), sandbox/postgis_lbs.sql (egts_lbs_map_match), SERVICE/egts/{models.py: SrCustom205 + NeighborCell, codec.py, handler.py (логирование + snap), lbs.py}, MOBILE_APP (lbs_collector.dart, tracker_provider.dart, egts_builder.dart).</w:t>
+      </w:r>
+    </w:p>
+    <w:p>
+      <w:r>
+        <w:t>Статус: полностью прототипировано и перенесено в реальный код (SERVICE + PARSER + MOBILE_APP). Готово к интеграции в РНИС для слабого GNSS.</w:t>
+      </w:r>
     </w:p>
     <w:sectPr>
       <w:headerReference w:type="default" r:id="rId12"/>

</xml_diff>